<commit_message>
R1: module dead load applied as UDL on the rafters (client comment, no purlins)
- w = (Wm/(L W)) x (L/2) = Wm/(2W) = 0.1259 N/mm over the 1134 mm module contact zone; rafter self-weight and seismic mass also UDL
- STAAD: 12 nodes/members (Pa, Pb delimit the zone), UNI GY/GX member loads; alt file with module wind as UDL
- Excel: tributary derivation, UDL-aware rafter statics with exact zero-shear peak moment, module-bolt demand rows, Revision sheet
- Only the rafter changes: peak M 28.2 -> 58.7 N.m, UR 0.058 -> 0.116; reactions, J-bolts, ballast unchanged
- Verified: closed form vs matrix solver 2e-10, Excel vs engine 308 cells 1.7e-13, live linkage 3e-15, STAAD text round-trip 5e-8

Co-Authored-By: Claude Sonnet 5.5 <noreply@anthropic.com>
Claude-Session: https://claude.ai/code/session_019HoR2givhRNHq9KssEQoeh
</commit_message>
<xml_diff>
--- a/report/CDSCO_45kW_Ballast_MMS_Design_Report.docx
+++ b/report/CDSCO_45kW_Ballast_MMS_Design_Report.docx
@@ -189,7 +189,7 @@
               <w:rPr>
                 <w:sz w:val="17"/>
               </w:rPr>
-              <w:t>DC-CDSCO-45kWp-R0  -  DRAFT FOR REVIEW  -  30 Sep 2026</w:t>
+              <w:t>DC-CDSCO-45kWp-R1  -  REVISION R1 (supersedes R0)  -  DRAFT FOR REVIEW  -  08 Oct 2026</w:t>
             </w:r>
           </w:p>
         </w:tc>
@@ -271,8 +271,658 @@
           <w:color w:val="7F0000"/>
           <w:sz w:val="18"/>
         </w:rPr>
-        <w:t>Status of this draft: every numeric result is reproduced by three independent routes (closed-form statics in Excel, a separate matrix-stiffness solver, and a round-trip of the generated STAAD input). STAAD.Pro itself has not been run (not available in the authoring environment); the file is ready to run and the workbook has a comparison table for the STAAD output. Several design-basis inputs are assumptions (Section 3.3) and two are decisive (Section 11).</w:t>
+        <w:t>Status of this draft (R1): every numeric result is reproduced by three independent routes (closed-form statics in Excel, a separate matrix-stiffness solver, and a round-trip of the generated STAAD input). STAAD.Pro itself has not been run (not available in the authoring environment); the file is ready to run and the workbook has a comparison table for the STAAD output. Several design-basis inputs are assumptions (Section 3.3) and two are decisive (Section 11).</w:t>
       </w:r>
+    </w:p>
+    <w:p>
+      <w:pPr>
+        <w:pStyle w:val="Heading1"/>
+      </w:pPr>
+      <w:r>
+        <w:t>0  Revision R1 - response to client comment</w:t>
+      </w:r>
+    </w:p>
+    <w:p>
+      <w:pPr>
+        <w:spacing w:after="60"/>
+      </w:pPr>
+      <w:r>
+        <w:rPr>
+          <w:b w:val="0"/>
+          <w:i/>
+        </w:rPr>
+        <w:t>Client comment: since no purlins are provided in the proposed MMS arrangement and the PV modules are directly supported by the rafters, the module self-weight shall not be considered as concentrated/point loads at the joints. Revise the STAAD model by applying the module dead load as an appropriate UDL on the supporting rafters based on the actual module dimensions, support arrangement and tributary length; revise the analysis, design and load calculations accordingly.</w:t>
+      </w:r>
+    </w:p>
+    <w:p>
+      <w:pPr>
+        <w:pStyle w:val="ListBullet"/>
+        <w:spacing w:after="20"/>
+      </w:pPr>
+      <w:r>
+        <w:rPr>
+          <w:b/>
+        </w:rPr>
+        <w:t xml:space="preserve">Accepted and implemented. </w:t>
+      </w:r>
+      <w:r>
+        <w:t>The module dead load is now a UDL on each rafter over the module contact length: w = (Wm / (L x W)) x (L / 2) = Wm / (2 W) = 0.1259 N/mm (= 0.1259 kN/m), acting over 1134 mm of the rafter (16.5 to 1150.5 mm from bolt B). Derivation in Section 4.2 and Fig 2.</w:t>
+      </w:r>
+    </w:p>
+    <w:p>
+      <w:pPr>
+        <w:pStyle w:val="ListBullet"/>
+        <w:spacing w:after="20"/>
+      </w:pPr>
+      <w:r>
+        <w:rPr>
+          <w:b/>
+        </w:rPr>
+        <w:t xml:space="preserve">Rafter self-weight </w:t>
+      </w:r>
+      <w:r>
+        <w:t>is also a UDL (0.0395 N/mm over B-C) instead of being lumped at the bolts; seismic mass of module and rafter follows the same distribution.</w:t>
+      </w:r>
+    </w:p>
+    <w:p>
+      <w:pPr>
+        <w:pStyle w:val="ListBullet"/>
+        <w:spacing w:after="20"/>
+      </w:pPr>
+      <w:r>
+        <w:rPr>
+          <w:b/>
+        </w:rPr>
+        <w:t xml:space="preserve">STAAD model: </w:t>
+      </w:r>
+      <w:r>
+        <w:t>two additional nodes (Pa, Pb) delimit the contact zone; module weight is applied as UNI GY on members 8-11 (rafter members 7-12 carry the rafter self-weight). No joint loads remain for dead load except the vertical member and base stubs.</w:t>
+      </w:r>
+    </w:p>
+    <w:p>
+      <w:pPr>
+        <w:pStyle w:val="ListBullet"/>
+        <w:spacing w:after="20"/>
+      </w:pPr>
+      <w:r>
+        <w:rPr>
+          <w:b/>
+        </w:rPr>
+        <w:t xml:space="preserve">Module wind </w:t>
+      </w:r>
+      <w:r>
+        <w:t>is a different load path: wind suction/pressure is transferred through the four M8 module bolts, so it remains point loads at the bolts (wind_mode 0, as R0). As a bounding case the wind is also applied as a UDL over the contact length (wind_mode 1, alternate STAAD file); both satisfy every check (Section 11).</w:t>
+      </w:r>
+    </w:p>
+    <w:p>
+      <w:pPr>
+        <w:pStyle w:val="ListBullet"/>
+        <w:spacing w:after="20"/>
+      </w:pPr>
+      <w:r>
+        <w:rPr>
+          <w:b/>
+        </w:rPr>
+        <w:t xml:space="preserve">Effect: </w:t>
+      </w:r>
+      <w:r>
+        <w:t>only the rafter changes. Peak rafter moment 58.7 N.m (R0 28.2), rafter utilisation 0.11 (R0 0.05). Reactions, J-bolt forces, base member, bolts and the ballast result are unchanged (resultant and line of action of the module load are the same).</w:t>
+      </w:r>
+    </w:p>
+    <w:tbl>
+      <w:tblPr>
+        <w:tblStyle w:val="TableGrid"/>
+        <w:tblW w:type="auto" w:w="0"/>
+        <w:jc w:val="center"/>
+        <w:tblLayout w:type="fixed"/>
+        <w:tblLook w:firstColumn="1" w:firstRow="1" w:lastColumn="0" w:lastRow="0" w:noHBand="0" w:noVBand="1" w:val="04A0"/>
+        <w:tblLayout w:type="fixed"/>
+      </w:tblPr>
+      <w:tblGrid>
+        <w:gridCol w:w="3515"/>
+        <w:gridCol w:w="2438"/>
+        <w:gridCol w:w="2438"/>
+        <w:gridCol w:w="1361"/>
+      </w:tblGrid>
+      <w:tr>
+        <w:tc>
+          <w:tcPr>
+            <w:tcW w:type="dxa" w:w="3515"/>
+            <w:shd w:val="clear" w:color="auto" w:fill="44546A"/>
+          </w:tcPr>
+          <w:p>
+            <w:r/>
+            <w:r>
+              <w:rPr>
+                <w:b/>
+                <w:color w:val="FFFFFF"/>
+                <w:sz w:val="17"/>
+              </w:rPr>
+              <w:t>Quantity</w:t>
+            </w:r>
+          </w:p>
+        </w:tc>
+        <w:tc>
+          <w:tcPr>
+            <w:tcW w:type="dxa" w:w="2438"/>
+            <w:shd w:val="clear" w:color="auto" w:fill="44546A"/>
+          </w:tcPr>
+          <w:p>
+            <w:r/>
+            <w:r>
+              <w:rPr>
+                <w:b/>
+                <w:color w:val="FFFFFF"/>
+                <w:sz w:val="17"/>
+              </w:rPr>
+              <w:t>R0 (point loads at bolts)</w:t>
+            </w:r>
+          </w:p>
+        </w:tc>
+        <w:tc>
+          <w:tcPr>
+            <w:tcW w:type="dxa" w:w="2438"/>
+            <w:shd w:val="clear" w:color="auto" w:fill="44546A"/>
+          </w:tcPr>
+          <w:p>
+            <w:r/>
+            <w:r>
+              <w:rPr>
+                <w:b/>
+                <w:color w:val="FFFFFF"/>
+                <w:sz w:val="17"/>
+              </w:rPr>
+              <w:t>R1 (UDL)</w:t>
+            </w:r>
+          </w:p>
+        </w:tc>
+        <w:tc>
+          <w:tcPr>
+            <w:tcW w:type="dxa" w:w="1361"/>
+            <w:shd w:val="clear" w:color="auto" w:fill="44546A"/>
+          </w:tcPr>
+          <w:p>
+            <w:r/>
+            <w:r>
+              <w:rPr>
+                <w:b/>
+                <w:color w:val="FFFFFF"/>
+                <w:sz w:val="17"/>
+              </w:rPr>
+              <w:t>Change</w:t>
+            </w:r>
+          </w:p>
+        </w:tc>
+      </w:tr>
+      <w:tr>
+        <w:tc>
+          <w:tcPr>
+            <w:tcW w:type="dxa" w:w="3515"/>
+          </w:tcPr>
+          <w:p>
+            <w:r/>
+            <w:r>
+              <w:rPr>
+                <w:sz w:val="17"/>
+              </w:rPr>
+              <w:t>Module dead load on a rafter</w:t>
+            </w:r>
+          </w:p>
+        </w:tc>
+        <w:tc>
+          <w:tcPr>
+            <w:tcW w:type="dxa" w:w="2438"/>
+          </w:tcPr>
+          <w:p>
+            <w:r/>
+            <w:r>
+              <w:rPr>
+                <w:sz w:val="17"/>
+              </w:rPr>
+              <w:t>2 x 71.4 N at the module bolts</w:t>
+            </w:r>
+          </w:p>
+        </w:tc>
+        <w:tc>
+          <w:tcPr>
+            <w:tcW w:type="dxa" w:w="2438"/>
+          </w:tcPr>
+          <w:p>
+            <w:r/>
+            <w:r>
+              <w:rPr>
+                <w:sz w:val="17"/>
+              </w:rPr>
+              <w:t>0.1259 N/mm over 1134 mm</w:t>
+            </w:r>
+          </w:p>
+        </w:tc>
+        <w:tc>
+          <w:tcPr>
+            <w:tcW w:type="dxa" w:w="1361"/>
+          </w:tcPr>
+          <w:p>
+            <w:r/>
+            <w:r>
+              <w:rPr>
+                <w:sz w:val="17"/>
+              </w:rPr>
+              <w:t>UDL</w:t>
+            </w:r>
+          </w:p>
+        </w:tc>
+      </w:tr>
+      <w:tr>
+        <w:tc>
+          <w:tcPr>
+            <w:tcW w:type="dxa" w:w="3515"/>
+          </w:tcPr>
+          <w:p>
+            <w:r/>
+            <w:r>
+              <w:rPr>
+                <w:sz w:val="17"/>
+              </w:rPr>
+              <w:t>Rafter max |M|, strength combos (N.m)</w:t>
+            </w:r>
+          </w:p>
+        </w:tc>
+        <w:tc>
+          <w:tcPr>
+            <w:tcW w:type="dxa" w:w="2438"/>
+          </w:tcPr>
+          <w:p>
+            <w:r/>
+            <w:r>
+              <w:rPr>
+                <w:sz w:val="17"/>
+              </w:rPr>
+              <w:t>28.2</w:t>
+            </w:r>
+          </w:p>
+        </w:tc>
+        <w:tc>
+          <w:tcPr>
+            <w:tcW w:type="dxa" w:w="2438"/>
+          </w:tcPr>
+          <w:p>
+            <w:r/>
+            <w:r>
+              <w:rPr>
+                <w:sz w:val="17"/>
+              </w:rPr>
+              <w:t>58.7</w:t>
+            </w:r>
+          </w:p>
+        </w:tc>
+        <w:tc>
+          <w:tcPr>
+            <w:tcW w:type="dxa" w:w="1361"/>
+          </w:tcPr>
+          <w:p>
+            <w:r/>
+            <w:r>
+              <w:rPr>
+                <w:sz w:val="17"/>
+              </w:rPr>
+              <w:t>x 2.08</w:t>
+            </w:r>
+          </w:p>
+        </w:tc>
+      </w:tr>
+      <w:tr>
+        <w:tc>
+          <w:tcPr>
+            <w:tcW w:type="dxa" w:w="3515"/>
+          </w:tcPr>
+          <w:p>
+            <w:r/>
+            <w:r>
+              <w:rPr>
+                <w:sz w:val="17"/>
+              </w:rPr>
+              <w:t>Rafter N+M utilisation (tension / compression)</w:t>
+            </w:r>
+          </w:p>
+        </w:tc>
+        <w:tc>
+          <w:tcPr>
+            <w:tcW w:type="dxa" w:w="2438"/>
+          </w:tcPr>
+          <w:p>
+            <w:r/>
+            <w:r>
+              <w:rPr>
+                <w:sz w:val="17"/>
+              </w:rPr>
+              <w:t>0.054 / 0.058</w:t>
+            </w:r>
+          </w:p>
+        </w:tc>
+        <w:tc>
+          <w:tcPr>
+            <w:tcW w:type="dxa" w:w="2438"/>
+          </w:tcPr>
+          <w:p>
+            <w:r/>
+            <w:r>
+              <w:rPr>
+                <w:sz w:val="17"/>
+              </w:rPr>
+              <w:t>0.111 / 0.116</w:t>
+            </w:r>
+          </w:p>
+        </w:tc>
+        <w:tc>
+          <w:tcPr>
+            <w:tcW w:type="dxa" w:w="1361"/>
+          </w:tcPr>
+          <w:p>
+            <w:r/>
+            <w:r>
+              <w:rPr>
+                <w:sz w:val="17"/>
+              </w:rPr>
+              <w:t>PASS</w:t>
+            </w:r>
+          </w:p>
+        </w:tc>
+      </w:tr>
+      <w:tr>
+        <w:tc>
+          <w:tcPr>
+            <w:tcW w:type="dxa" w:w="3515"/>
+          </w:tcPr>
+          <w:p>
+            <w:r/>
+            <w:r>
+              <w:rPr>
+                <w:sz w:val="17"/>
+              </w:rPr>
+              <w:t>Rafter deflection, service (mm; limit 6.48)</w:t>
+            </w:r>
+          </w:p>
+        </w:tc>
+        <w:tc>
+          <w:tcPr>
+            <w:tcW w:type="dxa" w:w="2438"/>
+          </w:tcPr>
+          <w:p>
+            <w:r/>
+            <w:r>
+              <w:rPr>
+                <w:sz w:val="17"/>
+              </w:rPr>
+              <w:t>0.200</w:t>
+            </w:r>
+          </w:p>
+        </w:tc>
+        <w:tc>
+          <w:tcPr>
+            <w:tcW w:type="dxa" w:w="2438"/>
+          </w:tcPr>
+          <w:p>
+            <w:r/>
+            <w:r>
+              <w:rPr>
+                <w:sz w:val="17"/>
+              </w:rPr>
+              <w:t>0.407</w:t>
+            </w:r>
+          </w:p>
+        </w:tc>
+        <w:tc>
+          <w:tcPr>
+            <w:tcW w:type="dxa" w:w="1361"/>
+          </w:tcPr>
+          <w:p>
+            <w:r/>
+            <w:r>
+              <w:rPr>
+                <w:sz w:val="17"/>
+              </w:rPr>
+              <w:t>PASS</w:t>
+            </w:r>
+          </w:p>
+        </w:tc>
+      </w:tr>
+      <w:tr>
+        <w:tc>
+          <w:tcPr>
+            <w:tcW w:type="dxa" w:w="3515"/>
+          </w:tcPr>
+          <w:p>
+            <w:r/>
+            <w:r>
+              <w:rPr>
+                <w:sz w:val="17"/>
+              </w:rPr>
+              <w:t>Max J-bolt tension, factored (N)</w:t>
+            </w:r>
+          </w:p>
+        </w:tc>
+        <w:tc>
+          <w:tcPr>
+            <w:tcW w:type="dxa" w:w="2438"/>
+          </w:tcPr>
+          <w:p>
+            <w:r/>
+            <w:r>
+              <w:rPr>
+                <w:sz w:val="17"/>
+              </w:rPr>
+              <w:t>1468.5</w:t>
+            </w:r>
+          </w:p>
+        </w:tc>
+        <w:tc>
+          <w:tcPr>
+            <w:tcW w:type="dxa" w:w="2438"/>
+          </w:tcPr>
+          <w:p>
+            <w:r/>
+            <w:r>
+              <w:rPr>
+                <w:sz w:val="17"/>
+              </w:rPr>
+              <w:t>1468.5</w:t>
+            </w:r>
+          </w:p>
+        </w:tc>
+        <w:tc>
+          <w:tcPr>
+            <w:tcW w:type="dxa" w:w="1361"/>
+          </w:tcPr>
+          <w:p>
+            <w:r/>
+            <w:r>
+              <w:rPr>
+                <w:sz w:val="17"/>
+              </w:rPr>
+              <w:t>unchanged</w:t>
+            </w:r>
+          </w:p>
+        </w:tc>
+      </w:tr>
+      <w:tr>
+        <w:tc>
+          <w:tcPr>
+            <w:tcW w:type="dxa" w:w="3515"/>
+          </w:tcPr>
+          <w:p>
+            <w:r/>
+            <w:r>
+              <w:rPr>
+                <w:sz w:val="17"/>
+              </w:rPr>
+              <w:t>Reactions J1..J4, combination C2 (N)</w:t>
+            </w:r>
+          </w:p>
+        </w:tc>
+        <w:tc>
+          <w:tcPr>
+            <w:tcW w:type="dxa" w:w="2438"/>
+          </w:tcPr>
+          <w:p>
+            <w:r/>
+            <w:r>
+              <w:rPr>
+                <w:sz w:val="17"/>
+              </w:rPr>
+              <w:t>-1468.5, 774.2, 738.8, -1396.1</w:t>
+            </w:r>
+          </w:p>
+        </w:tc>
+        <w:tc>
+          <w:tcPr>
+            <w:tcW w:type="dxa" w:w="2438"/>
+          </w:tcPr>
+          <w:p>
+            <w:r/>
+            <w:r>
+              <w:rPr>
+                <w:sz w:val="17"/>
+              </w:rPr>
+              <w:t>-1468.5, 774.1, 738.8, -1396.2</w:t>
+            </w:r>
+          </w:p>
+        </w:tc>
+        <w:tc>
+          <w:tcPr>
+            <w:tcW w:type="dxa" w:w="1361"/>
+          </w:tcPr>
+          <w:p>
+            <w:r/>
+            <w:r>
+              <w:rPr>
+                <w:sz w:val="17"/>
+              </w:rPr>
+              <w:t>&lt;= 0.1 N</w:t>
+            </w:r>
+          </w:p>
+        </w:tc>
+      </w:tr>
+      <w:tr>
+        <w:tc>
+          <w:tcPr>
+            <w:tcW w:type="dxa" w:w="3515"/>
+          </w:tcPr>
+          <w:p>
+            <w:r/>
+            <w:r>
+              <w:rPr>
+                <w:sz w:val="17"/>
+              </w:rPr>
+              <w:t>Required block length, 300 x 250 section (mm)</w:t>
+            </w:r>
+          </w:p>
+        </w:tc>
+        <w:tc>
+          <w:tcPr>
+            <w:tcW w:type="dxa" w:w="2438"/>
+          </w:tcPr>
+          <w:p>
+            <w:r/>
+            <w:r>
+              <w:rPr>
+                <w:sz w:val="17"/>
+              </w:rPr>
+              <w:t>633.4</w:t>
+            </w:r>
+          </w:p>
+        </w:tc>
+        <w:tc>
+          <w:tcPr>
+            <w:tcW w:type="dxa" w:w="2438"/>
+          </w:tcPr>
+          <w:p>
+            <w:r/>
+            <w:r>
+              <w:rPr>
+                <w:sz w:val="17"/>
+              </w:rPr>
+              <w:t>633.4</w:t>
+            </w:r>
+          </w:p>
+        </w:tc>
+        <w:tc>
+          <w:tcPr>
+            <w:tcW w:type="dxa" w:w="1361"/>
+          </w:tcPr>
+          <w:p>
+            <w:r/>
+            <w:r>
+              <w:rPr>
+                <w:sz w:val="17"/>
+              </w:rPr>
+              <w:t>unchanged</w:t>
+            </w:r>
+          </w:p>
+        </w:tc>
+      </w:tr>
+      <w:tr>
+        <w:tc>
+          <w:tcPr>
+            <w:tcW w:type="dxa" w:w="3515"/>
+          </w:tcPr>
+          <w:p>
+            <w:r/>
+            <w:r>
+              <w:rPr>
+                <w:sz w:val="17"/>
+              </w:rPr>
+              <w:t>Sliding utilisation at 650 mm</w:t>
+            </w:r>
+          </w:p>
+        </w:tc>
+        <w:tc>
+          <w:tcPr>
+            <w:tcW w:type="dxa" w:w="2438"/>
+          </w:tcPr>
+          <w:p>
+            <w:r/>
+            <w:r>
+              <w:rPr>
+                <w:sz w:val="17"/>
+              </w:rPr>
+              <w:t>0.929</w:t>
+            </w:r>
+          </w:p>
+        </w:tc>
+        <w:tc>
+          <w:tcPr>
+            <w:tcW w:type="dxa" w:w="2438"/>
+          </w:tcPr>
+          <w:p>
+            <w:r/>
+            <w:r>
+              <w:rPr>
+                <w:sz w:val="17"/>
+              </w:rPr>
+              <w:t>0.929</w:t>
+            </w:r>
+          </w:p>
+        </w:tc>
+        <w:tc>
+          <w:tcPr>
+            <w:tcW w:type="dxa" w:w="1361"/>
+          </w:tcPr>
+          <w:p>
+            <w:r/>
+            <w:r>
+              <w:rPr>
+                <w:sz w:val="17"/>
+              </w:rPr>
+              <w:t>unchanged</w:t>
+            </w:r>
+          </w:p>
+        </w:tc>
+      </w:tr>
+    </w:tbl>
+    <w:p>
+      <w:pPr>
+        <w:spacing w:after="40"/>
+      </w:pPr>
     </w:p>
     <w:p>
       <w:pPr>
@@ -292,14 +942,14 @@
         <w:tblLayout w:type="fixed"/>
       </w:tblPr>
       <w:tblGrid>
-        <w:gridCol w:w="4706"/>
-        <w:gridCol w:w="4139"/>
-        <w:gridCol w:w="907"/>
+        <w:gridCol w:w="4309"/>
+        <w:gridCol w:w="4195"/>
+        <w:gridCol w:w="1247"/>
       </w:tblGrid>
       <w:tr>
         <w:tc>
           <w:tcPr>
-            <w:tcW w:type="dxa" w:w="4706"/>
+            <w:tcW w:type="dxa" w:w="4309"/>
             <w:shd w:val="clear" w:color="auto" w:fill="44546A"/>
           </w:tcPr>
           <w:p>
@@ -316,7 +966,7 @@
         </w:tc>
         <w:tc>
           <w:tcPr>
-            <w:tcW w:type="dxa" w:w="4139"/>
+            <w:tcW w:type="dxa" w:w="4195"/>
             <w:shd w:val="clear" w:color="auto" w:fill="44546A"/>
           </w:tcPr>
           <w:p>
@@ -333,7 +983,7 @@
         </w:tc>
         <w:tc>
           <w:tcPr>
-            <w:tcW w:type="dxa" w:w="907"/>
+            <w:tcW w:type="dxa" w:w="1247"/>
             <w:shd w:val="clear" w:color="auto" w:fill="44546A"/>
           </w:tcPr>
           <w:p>
@@ -352,7 +1002,7 @@
       <w:tr>
         <w:tc>
           <w:tcPr>
-            <w:tcW w:type="dxa" w:w="4706"/>
+            <w:tcW w:type="dxa" w:w="4309"/>
           </w:tcPr>
           <w:p>
             <w:r/>
@@ -366,7 +1016,7 @@
         </w:tc>
         <w:tc>
           <w:tcPr>
-            <w:tcW w:type="dxa" w:w="4139"/>
+            <w:tcW w:type="dxa" w:w="4195"/>
           </w:tcPr>
           <w:p>
             <w:r/>
@@ -380,7 +1030,7 @@
         </w:tc>
         <w:tc>
           <w:tcPr>
-            <w:tcW w:type="dxa" w:w="907"/>
+            <w:tcW w:type="dxa" w:w="1247"/>
             <w:shd w:val="clear" w:color="auto" w:fill="C6EFCE"/>
           </w:tcPr>
           <w:p>
@@ -398,7 +1048,7 @@
       <w:tr>
         <w:tc>
           <w:tcPr>
-            <w:tcW w:type="dxa" w:w="4706"/>
+            <w:tcW w:type="dxa" w:w="4309"/>
           </w:tcPr>
           <w:p>
             <w:r/>
@@ -412,7 +1062,7 @@
         </w:tc>
         <w:tc>
           <w:tcPr>
-            <w:tcW w:type="dxa" w:w="4139"/>
+            <w:tcW w:type="dxa" w:w="4195"/>
           </w:tcPr>
           <w:p>
             <w:r/>
@@ -426,7 +1076,7 @@
         </w:tc>
         <w:tc>
           <w:tcPr>
-            <w:tcW w:type="dxa" w:w="907"/>
+            <w:tcW w:type="dxa" w:w="1247"/>
             <w:shd w:val="clear" w:color="auto" w:fill="C6EFCE"/>
           </w:tcPr>
           <w:p>
@@ -444,7 +1094,7 @@
       <w:tr>
         <w:tc>
           <w:tcPr>
-            <w:tcW w:type="dxa" w:w="4706"/>
+            <w:tcW w:type="dxa" w:w="4309"/>
           </w:tcPr>
           <w:p>
             <w:r/>
@@ -458,7 +1108,7 @@
         </w:tc>
         <w:tc>
           <w:tcPr>
-            <w:tcW w:type="dxa" w:w="4139"/>
+            <w:tcW w:type="dxa" w:w="4195"/>
           </w:tcPr>
           <w:p>
             <w:r/>
@@ -472,7 +1122,7 @@
         </w:tc>
         <w:tc>
           <w:tcPr>
-            <w:tcW w:type="dxa" w:w="907"/>
+            <w:tcW w:type="dxa" w:w="1247"/>
             <w:shd w:val="clear" w:color="auto" w:fill="C6EFCE"/>
           </w:tcPr>
           <w:p>
@@ -490,7 +1140,7 @@
       <w:tr>
         <w:tc>
           <w:tcPr>
-            <w:tcW w:type="dxa" w:w="4706"/>
+            <w:tcW w:type="dxa" w:w="4309"/>
           </w:tcPr>
           <w:p>
             <w:r/>
@@ -504,7 +1154,7 @@
         </w:tc>
         <w:tc>
           <w:tcPr>
-            <w:tcW w:type="dxa" w:w="4139"/>
+            <w:tcW w:type="dxa" w:w="4195"/>
           </w:tcPr>
           <w:p>
             <w:r/>
@@ -518,7 +1168,7 @@
         </w:tc>
         <w:tc>
           <w:tcPr>
-            <w:tcW w:type="dxa" w:w="907"/>
+            <w:tcW w:type="dxa" w:w="1247"/>
             <w:shd w:val="clear" w:color="auto" w:fill="FFEB9C"/>
           </w:tcPr>
           <w:p>
@@ -536,7 +1186,7 @@
       <w:tr>
         <w:tc>
           <w:tcPr>
-            <w:tcW w:type="dxa" w:w="4706"/>
+            <w:tcW w:type="dxa" w:w="4309"/>
           </w:tcPr>
           <w:p>
             <w:r/>
@@ -550,7 +1200,7 @@
         </w:tc>
         <w:tc>
           <w:tcPr>
-            <w:tcW w:type="dxa" w:w="4139"/>
+            <w:tcW w:type="dxa" w:w="4195"/>
           </w:tcPr>
           <w:p>
             <w:r/>
@@ -564,7 +1214,7 @@
         </w:tc>
         <w:tc>
           <w:tcPr>
-            <w:tcW w:type="dxa" w:w="907"/>
+            <w:tcW w:type="dxa" w:w="1247"/>
             <w:shd w:val="clear" w:color="auto" w:fill="C6EFCE"/>
           </w:tcPr>
           <w:p>
@@ -582,7 +1232,7 @@
       <w:tr>
         <w:tc>
           <w:tcPr>
-            <w:tcW w:type="dxa" w:w="4706"/>
+            <w:tcW w:type="dxa" w:w="4309"/>
           </w:tcPr>
           <w:p>
             <w:r/>
@@ -596,21 +1246,21 @@
         </w:tc>
         <w:tc>
           <w:tcPr>
-            <w:tcW w:type="dxa" w:w="4139"/>
-          </w:tcPr>
-          <w:p>
-            <w:r/>
-            <w:r>
-              <w:rPr>
-                <w:sz w:val="17"/>
-              </w:rPr>
-              <w:t>UR 0.04</w:t>
-            </w:r>
-          </w:p>
-        </w:tc>
-        <w:tc>
-          <w:tcPr>
-            <w:tcW w:type="dxa" w:w="907"/>
+            <w:tcW w:type="dxa" w:w="4195"/>
+          </w:tcPr>
+          <w:p>
+            <w:r/>
+            <w:r>
+              <w:rPr>
+                <w:sz w:val="17"/>
+              </w:rPr>
+              <w:t>UR 0.06</w:t>
+            </w:r>
+          </w:p>
+        </w:tc>
+        <w:tc>
+          <w:tcPr>
+            <w:tcW w:type="dxa" w:w="1247"/>
             <w:shd w:val="clear" w:color="auto" w:fill="C6EFCE"/>
           </w:tcPr>
           <w:p>
@@ -628,7 +1278,7 @@
       <w:tr>
         <w:tc>
           <w:tcPr>
-            <w:tcW w:type="dxa" w:w="4706"/>
+            <w:tcW w:type="dxa" w:w="4309"/>
           </w:tcPr>
           <w:p>
             <w:r/>
@@ -642,7 +1292,7 @@
         </w:tc>
         <w:tc>
           <w:tcPr>
-            <w:tcW w:type="dxa" w:w="4139"/>
+            <w:tcW w:type="dxa" w:w="4195"/>
           </w:tcPr>
           <w:p>
             <w:r/>
@@ -656,7 +1306,7 @@
         </w:tc>
         <w:tc>
           <w:tcPr>
-            <w:tcW w:type="dxa" w:w="907"/>
+            <w:tcW w:type="dxa" w:w="1247"/>
             <w:shd w:val="clear" w:color="auto" w:fill="FFC7CE"/>
           </w:tcPr>
           <w:p>
@@ -1533,6 +2183,15 @@
         <w:spacing w:after="20"/>
       </w:pPr>
       <w:r>
+        <w:t>R1 load path: the module rests directly on the two rafters (no purlins). Module dead load is a UDL over the contact length (= module width 1134 mm) of each rafter, w = Wm/(2 W) = module weight per area x tributary width (L/2 = 1139.5 mm). The 439.5 mm module overhang beyond each rafter is carried by the module. Rafter self-weight is a UDL (stubs spread). Module WIND is transferred through the 4 M8 bolts (wind_mode 0); wind_mode 1 applies it as a UDL as well (bounding case) - both satisfy all checks.</w:t>
+      </w:r>
+    </w:p>
+    <w:p>
+      <w:pPr>
+        <w:pStyle w:val="ListBullet"/>
+        <w:spacing w:after="20"/>
+      </w:pPr>
+      <w:r>
         <w:t>J-bolt: plain-bar bond (tau_bd 1.2, M20) + standard hook 16 phi; practical minimum embedment 100 mm; concrete cone breakout not checked (no IS provision).</w:t>
       </w:r>
     </w:p>
@@ -2127,7 +2786,451 @@
         <w:pStyle w:val="Heading2"/>
       </w:pPr>
       <w:r>
-        <w:t>4.2  Dead and seismic load</w:t>
+        <w:t>4.2  Dead load: module as UDL on the rafters (R1), and seismic</w:t>
+      </w:r>
+    </w:p>
+    <w:p>
+      <w:pPr>
+        <w:spacing w:after="60"/>
+      </w:pPr>
+      <w:r>
+        <w:rPr>
+          <w:b w:val="0"/>
+          <w:i w:val="0"/>
+        </w:rPr>
+        <w:t>Support arrangement: no purlins - each module (L x W = 2279 x 1134 mm) rests directly on two rafters 1400 mm apart, centred, so 439.5 mm of module overhangs each rafter and is carried by the module itself. Each rafter therefore takes half the module: tributary width = L/2 = 1139.5 mm. The module lies parallel to the rafter and bears on it over its full width W = 1134 mm (contact zone 16.5 ... 1150.5 mm from bolt B, inside the rafter's physical length). The four M8 bolts (1400 x 1088 mm) only fix the module.</w:t>
+      </w:r>
+    </w:p>
+    <w:tbl>
+      <w:tblPr>
+        <w:tblStyle w:val="TableGrid"/>
+        <w:tblW w:type="auto" w:w="0"/>
+        <w:jc w:val="center"/>
+        <w:tblLayout w:type="fixed"/>
+        <w:tblLook w:firstColumn="1" w:firstRow="1" w:lastColumn="0" w:lastRow="0" w:noHBand="0" w:noVBand="1" w:val="04A0"/>
+        <w:tblLayout w:type="fixed"/>
+      </w:tblPr>
+      <w:tblGrid>
+        <w:gridCol w:w="2494"/>
+        <w:gridCol w:w="3742"/>
+        <w:gridCol w:w="3515"/>
+      </w:tblGrid>
+      <w:tr>
+        <w:tc>
+          <w:tcPr>
+            <w:tcW w:type="dxa" w:w="2494"/>
+            <w:shd w:val="clear" w:color="auto" w:fill="44546A"/>
+          </w:tcPr>
+          <w:p>
+            <w:r/>
+            <w:r>
+              <w:rPr>
+                <w:b/>
+                <w:color w:val="FFFFFF"/>
+                <w:sz w:val="17"/>
+              </w:rPr>
+              <w:t>Step</w:t>
+            </w:r>
+          </w:p>
+        </w:tc>
+        <w:tc>
+          <w:tcPr>
+            <w:tcW w:type="dxa" w:w="3742"/>
+            <w:shd w:val="clear" w:color="auto" w:fill="44546A"/>
+          </w:tcPr>
+          <w:p>
+            <w:r/>
+            <w:r>
+              <w:rPr>
+                <w:b/>
+                <w:color w:val="FFFFFF"/>
+                <w:sz w:val="17"/>
+              </w:rPr>
+              <w:t>Expression</w:t>
+            </w:r>
+          </w:p>
+        </w:tc>
+        <w:tc>
+          <w:tcPr>
+            <w:tcW w:type="dxa" w:w="3515"/>
+            <w:shd w:val="clear" w:color="auto" w:fill="44546A"/>
+          </w:tcPr>
+          <w:p>
+            <w:r/>
+            <w:r>
+              <w:rPr>
+                <w:b/>
+                <w:color w:val="FFFFFF"/>
+                <w:sz w:val="17"/>
+              </w:rPr>
+              <w:t>Value</w:t>
+            </w:r>
+          </w:p>
+        </w:tc>
+      </w:tr>
+      <w:tr>
+        <w:tc>
+          <w:tcPr>
+            <w:tcW w:type="dxa" w:w="2494"/>
+          </w:tcPr>
+          <w:p>
+            <w:r/>
+            <w:r>
+              <w:rPr>
+                <w:sz w:val="17"/>
+              </w:rPr>
+              <w:t>Module weight</w:t>
+            </w:r>
+          </w:p>
+        </w:tc>
+        <w:tc>
+          <w:tcPr>
+            <w:tcW w:type="dxa" w:w="3742"/>
+          </w:tcPr>
+          <w:p>
+            <w:r/>
+            <w:r>
+              <w:rPr>
+                <w:sz w:val="17"/>
+              </w:rPr>
+              <w:t>Wm = 29.1 kg x 9.81</w:t>
+            </w:r>
+          </w:p>
+        </w:tc>
+        <w:tc>
+          <w:tcPr>
+            <w:tcW w:type="dxa" w:w="3515"/>
+          </w:tcPr>
+          <w:p>
+            <w:r/>
+            <w:r>
+              <w:rPr>
+                <w:sz w:val="17"/>
+              </w:rPr>
+              <w:t>285.5 N</w:t>
+            </w:r>
+          </w:p>
+        </w:tc>
+      </w:tr>
+      <w:tr>
+        <w:tc>
+          <w:tcPr>
+            <w:tcW w:type="dxa" w:w="2494"/>
+          </w:tcPr>
+          <w:p>
+            <w:r/>
+            <w:r>
+              <w:rPr>
+                <w:sz w:val="17"/>
+              </w:rPr>
+              <w:t>Weight per unit area</w:t>
+            </w:r>
+          </w:p>
+        </w:tc>
+        <w:tc>
+          <w:tcPr>
+            <w:tcW w:type="dxa" w:w="3742"/>
+          </w:tcPr>
+          <w:p>
+            <w:r/>
+            <w:r>
+              <w:rPr>
+                <w:sz w:val="17"/>
+              </w:rPr>
+              <w:t>Wm / (L x W)</w:t>
+            </w:r>
+          </w:p>
+        </w:tc>
+        <w:tc>
+          <w:tcPr>
+            <w:tcW w:type="dxa" w:w="3515"/>
+          </w:tcPr>
+          <w:p>
+            <w:r/>
+            <w:r>
+              <w:rPr>
+                <w:sz w:val="17"/>
+              </w:rPr>
+              <w:t>110.46 N/m2 = 0.1105 kN/m2</w:t>
+            </w:r>
+          </w:p>
+        </w:tc>
+      </w:tr>
+      <w:tr>
+        <w:tc>
+          <w:tcPr>
+            <w:tcW w:type="dxa" w:w="2494"/>
+          </w:tcPr>
+          <w:p>
+            <w:r/>
+            <w:r>
+              <w:rPr>
+                <w:sz w:val="17"/>
+              </w:rPr>
+              <w:t>Tributary width per rafter</w:t>
+            </w:r>
+          </w:p>
+        </w:tc>
+        <w:tc>
+          <w:tcPr>
+            <w:tcW w:type="dxa" w:w="3742"/>
+          </w:tcPr>
+          <w:p>
+            <w:r/>
+            <w:r>
+              <w:rPr>
+                <w:sz w:val="17"/>
+              </w:rPr>
+              <w:t>L / 2</w:t>
+            </w:r>
+          </w:p>
+        </w:tc>
+        <w:tc>
+          <w:tcPr>
+            <w:tcW w:type="dxa" w:w="3515"/>
+          </w:tcPr>
+          <w:p>
+            <w:r/>
+            <w:r>
+              <w:rPr>
+                <w:sz w:val="17"/>
+              </w:rPr>
+              <w:t>1139.5 mm</w:t>
+            </w:r>
+          </w:p>
+        </w:tc>
+      </w:tr>
+      <w:tr>
+        <w:tc>
+          <w:tcPr>
+            <w:tcW w:type="dxa" w:w="2494"/>
+          </w:tcPr>
+          <w:p>
+            <w:r/>
+            <w:r>
+              <w:rPr>
+                <w:sz w:val="17"/>
+              </w:rPr>
+              <w:t>UDL on one rafter</w:t>
+            </w:r>
+          </w:p>
+        </w:tc>
+        <w:tc>
+          <w:tcPr>
+            <w:tcW w:type="dxa" w:w="3742"/>
+          </w:tcPr>
+          <w:p>
+            <w:r/>
+            <w:r>
+              <w:rPr>
+                <w:sz w:val="17"/>
+              </w:rPr>
+              <w:t>w = (Wm/(L W)) x (L/2) = Wm / (2 W)</w:t>
+            </w:r>
+          </w:p>
+        </w:tc>
+        <w:tc>
+          <w:tcPr>
+            <w:tcW w:type="dxa" w:w="3515"/>
+          </w:tcPr>
+          <w:p>
+            <w:r/>
+            <w:r>
+              <w:rPr>
+                <w:sz w:val="17"/>
+              </w:rPr>
+              <w:t>0.12587 N/mm  =  0.1259 kN/m</w:t>
+            </w:r>
+          </w:p>
+        </w:tc>
+      </w:tr>
+      <w:tr>
+        <w:tc>
+          <w:tcPr>
+            <w:tcW w:type="dxa" w:w="2494"/>
+          </w:tcPr>
+          <w:p>
+            <w:r/>
+            <w:r>
+              <w:rPr>
+                <w:sz w:val="17"/>
+              </w:rPr>
+              <w:t>Resultant per rafter</w:t>
+            </w:r>
+          </w:p>
+        </w:tc>
+        <w:tc>
+          <w:tcPr>
+            <w:tcW w:type="dxa" w:w="3742"/>
+          </w:tcPr>
+          <w:p>
+            <w:r/>
+            <w:r>
+              <w:rPr>
+                <w:sz w:val="17"/>
+              </w:rPr>
+              <w:t>w x W</w:t>
+            </w:r>
+          </w:p>
+        </w:tc>
+        <w:tc>
+          <w:tcPr>
+            <w:tcW w:type="dxa" w:w="3515"/>
+          </w:tcPr>
+          <w:p>
+            <w:r/>
+            <w:r>
+              <w:rPr>
+                <w:sz w:val="17"/>
+              </w:rPr>
+              <w:t>142.74 N = Wm/2  (2 rafters: 285.47 N = Wm)</w:t>
+            </w:r>
+          </w:p>
+        </w:tc>
+      </w:tr>
+      <w:tr>
+        <w:tc>
+          <w:tcPr>
+            <w:tcW w:type="dxa" w:w="2494"/>
+          </w:tcPr>
+          <w:p>
+            <w:r/>
+            <w:r>
+              <w:rPr>
+                <w:sz w:val="17"/>
+              </w:rPr>
+              <w:t>Rafter self-weight UDL</w:t>
+            </w:r>
+          </w:p>
+        </w:tc>
+        <w:tc>
+          <w:tcPr>
+            <w:tcW w:type="dxa" w:w="3742"/>
+          </w:tcPr>
+          <w:p>
+            <w:r/>
+            <w:r>
+              <w:rPr>
+                <w:sz w:val="17"/>
+              </w:rPr>
+              <w:t>ws x 1222.01 / 1165.62</w:t>
+            </w:r>
+          </w:p>
+        </w:tc>
+        <w:tc>
+          <w:tcPr>
+            <w:tcW w:type="dxa" w:w="3515"/>
+          </w:tcPr>
+          <w:p>
+            <w:r/>
+            <w:r>
+              <w:rPr>
+                <w:sz w:val="17"/>
+              </w:rPr>
+              <w:t>0.03953 N/mm</w:t>
+            </w:r>
+          </w:p>
+        </w:tc>
+      </w:tr>
+      <w:tr>
+        <w:tc>
+          <w:tcPr>
+            <w:tcW w:type="dxa" w:w="2494"/>
+          </w:tcPr>
+          <w:p>
+            <w:r/>
+            <w:r>
+              <w:rPr>
+                <w:sz w:val="17"/>
+              </w:rPr>
+              <w:t>Seismic (module + rafter)</w:t>
+            </w:r>
+          </w:p>
+        </w:tc>
+        <w:tc>
+          <w:tcPr>
+            <w:tcW w:type="dxa" w:w="3742"/>
+          </w:tcPr>
+          <w:p>
+            <w:r/>
+            <w:r>
+              <w:rPr>
+                <w:sz w:val="17"/>
+              </w:rPr>
+              <w:t>Ah x w (horizontal UDL)</w:t>
+            </w:r>
+          </w:p>
+        </w:tc>
+        <w:tc>
+          <w:tcPr>
+            <w:tcW w:type="dxa" w:w="3515"/>
+          </w:tcPr>
+          <w:p>
+            <w:r/>
+            <w:r>
+              <w:rPr>
+                <w:sz w:val="17"/>
+              </w:rPr>
+              <w:t>Ah = 0.100</w:t>
+            </w:r>
+          </w:p>
+        </w:tc>
+      </w:tr>
+    </w:tbl>
+    <w:p>
+      <w:pPr>
+        <w:spacing w:after="40"/>
+      </w:pPr>
+    </w:p>
+    <w:p>
+      <w:pPr>
+        <w:jc w:val="center"/>
+      </w:pPr>
+      <w:r>
+        <w:drawing>
+          <wp:inline xmlns:a="http://schemas.openxmlformats.org/drawingml/2006/main" xmlns:pic="http://schemas.openxmlformats.org/drawingml/2006/picture">
+            <wp:extent cx="5760000" cy="4503273"/>
+            <wp:docPr id="2" name="Picture 2"/>
+            <wp:cNvGraphicFramePr>
+              <a:graphicFrameLocks noChangeAspect="1"/>
+            </wp:cNvGraphicFramePr>
+            <a:graphic>
+              <a:graphicData uri="http://schemas.openxmlformats.org/drawingml/2006/picture">
+                <pic:pic>
+                  <pic:nvPicPr>
+                    <pic:cNvPr id="0" name="fig2_udl_derivation.png"/>
+                    <pic:cNvPicPr/>
+                  </pic:nvPicPr>
+                  <pic:blipFill>
+                    <a:blip r:embed="rId10"/>
+                    <a:stretch>
+                      <a:fillRect/>
+                    </a:stretch>
+                  </pic:blipFill>
+                  <pic:spPr>
+                    <a:xfrm>
+                      <a:off x="0" y="0"/>
+                      <a:ext cx="5760000" cy="4503273"/>
+                    </a:xfrm>
+                    <a:prstGeom prst="rect"/>
+                  </pic:spPr>
+                </pic:pic>
+              </a:graphicData>
+            </a:graphic>
+          </wp:inline>
+        </w:drawing>
+      </w:r>
+    </w:p>
+    <w:p>
+      <w:pPr>
+        <w:spacing w:after="60"/>
+      </w:pPr>
+      <w:r>
+        <w:rPr>
+          <w:b/>
+          <w:i w:val="0"/>
+        </w:rPr>
+        <w:t>Other dead loads:</w:t>
       </w:r>
     </w:p>
     <w:tbl>
@@ -2204,7 +3307,7 @@
               <w:rPr>
                 <w:sz w:val="17"/>
               </w:rPr>
-              <w:t>29.1 kg = 285.5 N (datasheet search, single source)</w:t>
+              <w:t>29.1 kg = 285.5 N (datasheet search, single source); applied as UDL, see above</w:t>
             </w:r>
           </w:p>
         </w:tc>
@@ -2312,8 +3415,8 @@
       <w:r>
         <w:drawing>
           <wp:inline xmlns:a="http://schemas.openxmlformats.org/drawingml/2006/main" xmlns:pic="http://schemas.openxmlformats.org/drawingml/2006/picture">
-            <wp:extent cx="6120000" cy="1938000"/>
-            <wp:docPr id="2" name="Picture 2"/>
+            <wp:extent cx="6120000" cy="1977231"/>
+            <wp:docPr id="3" name="Picture 3"/>
             <wp:cNvGraphicFramePr>
               <a:graphicFrameLocks noChangeAspect="1"/>
             </wp:cNvGraphicFramePr>
@@ -2321,11 +3424,11 @@
               <a:graphicData uri="http://schemas.openxmlformats.org/drawingml/2006/picture">
                 <pic:pic>
                   <pic:nvPicPr>
-                    <pic:cNvPr id="0" name="fig2_loads.png"/>
+                    <pic:cNvPr id="0" name="fig3_loads.png"/>
                     <pic:cNvPicPr/>
                   </pic:nvPicPr>
                   <pic:blipFill>
-                    <a:blip r:embed="rId10"/>
+                    <a:blip r:embed="rId11"/>
                     <a:stretch>
                       <a:fillRect/>
                     </a:stretch>
@@ -2333,7 +3436,7 @@
                   <pic:spPr>
                     <a:xfrm>
                       <a:off x="0" y="0"/>
-                      <a:ext cx="6120000" cy="1938000"/>
+                      <a:ext cx="6120000" cy="1977231"/>
                     </a:xfrm>
                     <a:prstGeom prst="rect"/>
                   </pic:spPr>
@@ -2794,7 +3897,7 @@
           <w:b w:val="0"/>
           <w:i w:val="0"/>
         </w:rPr>
-        <w:t>The frame is analysed as a plane model (STAAD file staad/CDSCO_45kW_Ballast_Frame.std): single-bolt joints are moment-free (vertical member is a truss element; inclined member pinned at C); the base member is continuous over four rigid J-bolt supports (J1 restrained in X and Y, J2-J4 in Y). Load points are the module bolts. The inclined member and vertical member are statically determinate; the base beam is solved with the three-moment equation in the workbook and with a full stiffness solution in STAAD.</w:t>
+        <w:t>The frame is analysed as a plane model (STAAD file staad/CDSCO_45kW_Ballast_Frame.std, 12 nodes, 12 members): single-bolt joints are moment-free (vertical member is a truss element; rafter pinned at C); the base member is continuous over four rigid J-bolt supports (J1 restrained in X and Y, J2-J4 in Y). R1 loads: module dead load and rafter self-weight are UDLs on the rafter (zone Pa-Pb, members 8-11 / 7-12); wind acts through the four module bolts (joint loads at S1, S2). The rafter and vertical member are statically determinate; its internal forces use closed-form shear/moment with the UDL zones and the exact zero-shear section. The base beam is solved with the three-moment equation in the workbook and with a full stiffness solution in STAAD.</w:t>
       </w:r>
     </w:p>
     <w:tbl>
@@ -2889,7 +3992,7 @@
               <w:rPr>
                 <w:sz w:val="17"/>
               </w:rPr>
-              <w:t>1263.4</w:t>
+              <w:t>1263.5</w:t>
             </w:r>
           </w:p>
         </w:tc>
@@ -2947,7 +4050,7 @@
               <w:rPr>
                 <w:sz w:val="17"/>
               </w:rPr>
-              <w:t>774.2</w:t>
+              <w:t>774.1</w:t>
             </w:r>
           </w:p>
         </w:tc>
@@ -3021,7 +4124,7 @@
               <w:rPr>
                 <w:sz w:val="17"/>
               </w:rPr>
-              <w:t>1187.1</w:t>
+              <w:t>1187.0</w:t>
             </w:r>
           </w:p>
         </w:tc>
@@ -3035,7 +4138,7 @@
               <w:rPr>
                 <w:sz w:val="17"/>
               </w:rPr>
-              <w:t>-1396.1</w:t>
+              <w:t>-1396.2</w:t>
             </w:r>
           </w:p>
         </w:tc>
@@ -3109,7 +4212,7 @@
               <w:rPr>
                 <w:sz w:val="17"/>
               </w:rPr>
-              <w:t>-592.9</w:t>
+              <w:t>-593.0</w:t>
             </w:r>
           </w:p>
         </w:tc>
@@ -3139,7 +4242,7 @@
               <w:rPr>
                 <w:sz w:val="17"/>
               </w:rPr>
-              <w:t>Inclined moment at S1 / S2 (N.m)</w:t>
+              <w:t>Rafter |M| at bolt 1 / bolt 2 / peak (N.m)</w:t>
             </w:r>
           </w:p>
         </w:tc>
@@ -3153,7 +4256,7 @@
               <w:rPr>
                 <w:sz w:val="17"/>
               </w:rPr>
-              <w:t>-23.1 / -22.3</w:t>
+              <w:t>23.0 / 22.2 / 58.7</w:t>
             </w:r>
           </w:p>
         </w:tc>
@@ -3167,7 +4270,7 @@
               <w:rPr>
                 <w:sz w:val="17"/>
               </w:rPr>
-              <w:t>28.2 / 27.2</w:t>
+              <w:t>28.3 / 27.3 / 6.1</w:t>
             </w:r>
           </w:p>
         </w:tc>
@@ -3231,7 +4334,7 @@
           <w:b w:val="0"/>
           <w:i w:val="0"/>
         </w:rPr>
-        <w:t>Note the J-bolt reactions: continuity of the base angle over each bolt pair turns the overhang load into a couple, so J1 carries about four times the average uplift share (Fig 3).</w:t>
+        <w:t>Note the J-bolt reactions: continuity of the base angle over each bolt pair turns the overhang load into a couple, so J1 carries about four times the average uplift share (Fig 4).</w:t>
       </w:r>
     </w:p>
     <w:p>
@@ -3242,7 +4345,7 @@
         <w:drawing>
           <wp:inline xmlns:a="http://schemas.openxmlformats.org/drawingml/2006/main" xmlns:pic="http://schemas.openxmlformats.org/drawingml/2006/picture">
             <wp:extent cx="5760000" cy="4128000"/>
-            <wp:docPr id="3" name="Picture 3"/>
+            <wp:docPr id="4" name="Picture 4"/>
             <wp:cNvGraphicFramePr>
               <a:graphicFrameLocks noChangeAspect="1"/>
             </wp:cNvGraphicFramePr>
@@ -3250,11 +4353,11 @@
               <a:graphicData uri="http://schemas.openxmlformats.org/drawingml/2006/picture">
                 <pic:pic>
                   <pic:nvPicPr>
-                    <pic:cNvPr id="0" name="fig3_results_C2.png"/>
+                    <pic:cNvPr id="0" name="fig4_results_C2.png"/>
                     <pic:cNvPicPr/>
                   </pic:nvPicPr>
                   <pic:blipFill>
-                    <a:blip r:embed="rId11"/>
+                    <a:blip r:embed="rId12"/>
                     <a:stretch>
                       <a:fillRect/>
                     </a:stretch>
@@ -3263,6 +4366,45 @@
                     <a:xfrm>
                       <a:off x="0" y="0"/>
                       <a:ext cx="5760000" cy="4128000"/>
+                    </a:xfrm>
+                    <a:prstGeom prst="rect"/>
+                  </pic:spPr>
+                </pic:pic>
+              </a:graphicData>
+            </a:graphic>
+          </wp:inline>
+        </w:drawing>
+      </w:r>
+    </w:p>
+    <w:p>
+      <w:pPr>
+        <w:jc w:val="center"/>
+      </w:pPr>
+      <w:r>
+        <w:drawing>
+          <wp:inline xmlns:a="http://schemas.openxmlformats.org/drawingml/2006/main" xmlns:pic="http://schemas.openxmlformats.org/drawingml/2006/picture">
+            <wp:extent cx="5760000" cy="2199273"/>
+            <wp:docPr id="5" name="Picture 5"/>
+            <wp:cNvGraphicFramePr>
+              <a:graphicFrameLocks noChangeAspect="1"/>
+            </wp:cNvGraphicFramePr>
+            <a:graphic>
+              <a:graphicData uri="http://schemas.openxmlformats.org/drawingml/2006/picture">
+                <pic:pic>
+                  <pic:nvPicPr>
+                    <pic:cNvPr id="0" name="fig5_rafter_moment.png"/>
+                    <pic:cNvPicPr/>
+                  </pic:nvPicPr>
+                  <pic:blipFill>
+                    <a:blip r:embed="rId13"/>
+                    <a:stretch>
+                      <a:fillRect/>
+                    </a:stretch>
+                  </pic:blipFill>
+                  <pic:spPr>
+                    <a:xfrm>
+                      <a:off x="0" y="0"/>
+                      <a:ext cx="5760000" cy="2199273"/>
                     </a:xfrm>
                     <a:prstGeom prst="rect"/>
                   </pic:spPr>
@@ -3287,7 +4429,7 @@
         <w:spacing w:after="20"/>
       </w:pPr>
       <w:r>
-        <w:t>Closed-form statics (Excel) vs independent matrix-stiffness solver: agree to 1.7e-11 for all four load cases (reactions, moments, axial forces, tip deflections); equilibrium identities hold to machine precision.</w:t>
+        <w:t>Closed-form statics (Excel, with UDL zones) vs independent matrix-stiffness solver (rafter split at the contact ends): agree to 2e-10 for all four load cases in both wind modes (reactions, moments, axial/shear at 8 rafter sections, tip deflections); equilibrium identities hold to machine precision.</w:t>
       </w:r>
     </w:p>
     <w:p>
@@ -3296,7 +4438,7 @@
         <w:spacing w:after="20"/>
       </w:pPr>
       <w:r>
-        <w:t>Excel recalculated in LibreOffice: 218 key cells compared with the Python engine, worst difference 1.2e-14; no formula errors in 1271 formulas.</w:t>
+        <w:t>Peak rafter moment (closed form, zero-shear section) vs a dense scan of the solver's moment diagram, all 8 combinations: agree within 2e-5.</w:t>
       </w:r>
     </w:p>
     <w:p>
@@ -3305,7 +4447,25 @@
         <w:spacing w:after="20"/>
       </w:pPr>
       <w:r>
-        <w:t>STAAD input text re-parsed and solved: agrees with the workbook to 5.5e-8 for all 8 combinations (print-precision level).</w:t>
+        <w:t>Excel recalculated in LibreOffice: 308 key cells compared with the Python engine, worst difference 1.7e-13; no formula errors. Live-linkage test: 10 inputs changed at once (incl. module width, wind_mode) -&gt; outputs agree to 3e-15.</w:t>
+      </w:r>
+    </w:p>
+    <w:p>
+      <w:pPr>
+        <w:pStyle w:val="ListBullet"/>
+        <w:spacing w:after="20"/>
+      </w:pPr>
+      <w:r>
+        <w:t>STAAD input text re-parsed (12 nodes, UNI loads) and solved: agrees with the workbook to 5e-8 for all 8 combinations, both STAAD files.</w:t>
+      </w:r>
+    </w:p>
+    <w:p>
+      <w:pPr>
+        <w:pStyle w:val="ListBullet"/>
+        <w:spacing w:after="20"/>
+      </w:pPr>
+      <w:r>
+        <w:t>To confirm in STAAD: sum of FY reactions for load case 1 = 243.5 N (confirms UNI GY is per unit member length).</w:t>
       </w:r>
     </w:p>
     <w:p>
@@ -3322,7 +4482,7 @@
         <w:pStyle w:val="Heading1"/>
       </w:pPr>
       <w:r>
-        <w:t>6  Member design - IS 800:2007</w:t>
+        <w:t>6  Member design - IS 800:2007 (rafter = inclined member B-C)</w:t>
       </w:r>
     </w:p>
     <w:tbl>
@@ -3551,7 +4711,7 @@
               <w:rPr>
                 <w:sz w:val="17"/>
               </w:rPr>
-              <w:t>N 104 N, M 28.2 N.m</w:t>
+              <w:t>N 104 N, M 58.7 N.m</w:t>
             </w:r>
           </w:p>
         </w:tc>
@@ -3579,7 +4739,7 @@
               <w:rPr>
                 <w:sz w:val="17"/>
               </w:rPr>
-              <w:t>0.054</w:t>
+              <w:t>0.111</w:t>
             </w:r>
           </w:p>
         </w:tc>
@@ -3609,7 +4769,7 @@
               <w:rPr>
                 <w:sz w:val="17"/>
               </w:rPr>
-              <w:t>N 157 N, M 28.2 N.m</w:t>
+              <w:t>N 157 N, M 58.7 N.m</w:t>
             </w:r>
           </w:p>
         </w:tc>
@@ -3637,7 +4797,7 @@
               <w:rPr>
                 <w:sz w:val="17"/>
               </w:rPr>
-              <w:t>0.058</w:t>
+              <w:t>0.116</w:t>
             </w:r>
           </w:p>
         </w:tc>
@@ -3667,7 +4827,7 @@
               <w:rPr>
                 <w:sz w:val="17"/>
               </w:rPr>
-              <w:t>715 N</w:t>
+              <w:t>719 N</w:t>
             </w:r>
           </w:p>
         </w:tc>
@@ -4305,7 +5465,7 @@
               <w:rPr>
                 <w:sz w:val="17"/>
               </w:rPr>
-              <w:t>39</w:t>
+              <w:t>29</w:t>
             </w:r>
           </w:p>
         </w:tc>
@@ -4319,7 +5479,7 @@
               <w:rPr>
                 <w:sz w:val="17"/>
               </w:rPr>
-              <w:t>714</w:t>
+              <w:t>735</w:t>
             </w:r>
           </w:p>
         </w:tc>
@@ -4361,7 +5521,7 @@
               <w:rPr>
                 <w:sz w:val="17"/>
               </w:rPr>
-              <w:t>0.039</w:t>
+              <w:t>0.040</w:t>
             </w:r>
           </w:p>
         </w:tc>
@@ -5255,7 +6415,7 @@
               <w:rPr>
                 <w:sz w:val="17"/>
               </w:rPr>
-              <w:t>772 N (79 kg)</w:t>
+              <w:t>771 N (79 kg)</w:t>
             </w:r>
           </w:p>
         </w:tc>
@@ -5600,7 +6760,7 @@
               <w:rPr>
                 <w:sz w:val="17"/>
               </w:rPr>
-              <w:t>888726</w:t>
+              <w:t>888728</w:t>
             </w:r>
           </w:p>
         </w:tc>
@@ -5614,7 +6774,7 @@
               <w:rPr>
                 <w:sz w:val="17"/>
               </w:rPr>
-              <w:t>1161631</w:t>
+              <w:t>1161632</w:t>
             </w:r>
           </w:p>
         </w:tc>
@@ -5984,7 +7144,7 @@
               <w:rPr>
                 <w:sz w:val="17"/>
               </w:rPr>
-              <w:t>1161631</w:t>
+              <w:t>1161632</w:t>
             </w:r>
           </w:p>
         </w:tc>
@@ -6033,7 +7193,7 @@
         <w:drawing>
           <wp:inline xmlns:a="http://schemas.openxmlformats.org/drawingml/2006/main" xmlns:pic="http://schemas.openxmlformats.org/drawingml/2006/picture">
             <wp:extent cx="5580000" cy="2840727"/>
-            <wp:docPr id="4" name="Picture 4"/>
+            <wp:docPr id="6" name="Picture 6"/>
             <wp:cNvGraphicFramePr>
               <a:graphicFrameLocks noChangeAspect="1"/>
             </wp:cNvGraphicFramePr>
@@ -6041,11 +7201,11 @@
               <a:graphicData uri="http://schemas.openxmlformats.org/drawingml/2006/picture">
                 <pic:pic>
                   <pic:nvPicPr>
-                    <pic:cNvPr id="0" name="fig4_ballast.png"/>
+                    <pic:cNvPr id="0" name="fig6_ballast.png"/>
                     <pic:cNvPicPr/>
                   </pic:nvPicPr>
                   <pic:blipFill>
-                    <a:blip r:embed="rId12"/>
+                    <a:blip r:embed="rId14"/>
                     <a:stretch>
                       <a:fillRect/>
                     </a:stretch>
@@ -6194,7 +7354,7 @@
               <w:rPr>
                 <w:sz w:val="17"/>
               </w:rPr>
-              <w:t>1469</w:t>
+              <w:t>1468</w:t>
             </w:r>
           </w:p>
         </w:tc>
@@ -6208,7 +7368,7 @@
               <w:rPr>
                 <w:sz w:val="17"/>
               </w:rPr>
-              <w:t>1469</w:t>
+              <w:t>1468</w:t>
             </w:r>
           </w:p>
         </w:tc>
@@ -6974,7 +8134,7 @@
               <w:rPr>
                 <w:sz w:val="17"/>
               </w:rPr>
-              <w:t>0.200</w:t>
+              <w:t>0.029</w:t>
             </w:r>
           </w:p>
         </w:tc>
@@ -7002,7 +8162,7 @@
               <w:rPr>
                 <w:sz w:val="17"/>
               </w:rPr>
-              <w:t>0.031</w:t>
+              <w:t>0.004</w:t>
             </w:r>
           </w:p>
         </w:tc>
@@ -8056,6 +9216,311 @@
                 <w:sz w:val="17"/>
               </w:rPr>
               <w:t>0.56</w:t>
+            </w:r>
+          </w:p>
+        </w:tc>
+      </w:tr>
+    </w:tbl>
+    <w:p>
+      <w:pPr>
+        <w:spacing w:after="40"/>
+      </w:pPr>
+    </w:p>
+    <w:p>
+      <w:pPr>
+        <w:spacing w:after="60"/>
+      </w:pPr>
+      <w:r>
+        <w:rPr>
+          <w:b/>
+          <w:i w:val="0"/>
+        </w:rPr>
+        <w:t>Module wind as UDL (wind_mode 1) instead of through the four bolts - bounding case for the rafter:</w:t>
+      </w:r>
+    </w:p>
+    <w:tbl>
+      <w:tblPr>
+        <w:tblStyle w:val="TableGrid"/>
+        <w:tblW w:type="auto" w:w="0"/>
+        <w:jc w:val="center"/>
+        <w:tblLayout w:type="fixed"/>
+        <w:tblLook w:firstColumn="1" w:firstRow="1" w:lastColumn="0" w:lastRow="0" w:noHBand="0" w:noVBand="1" w:val="04A0"/>
+        <w:tblLayout w:type="fixed"/>
+      </w:tblPr>
+      <w:tblGrid>
+        <w:gridCol w:w="3969"/>
+        <w:gridCol w:w="2891"/>
+        <w:gridCol w:w="2891"/>
+      </w:tblGrid>
+      <w:tr>
+        <w:tc>
+          <w:tcPr>
+            <w:tcW w:type="dxa" w:w="3969"/>
+            <w:shd w:val="clear" w:color="auto" w:fill="44546A"/>
+          </w:tcPr>
+          <w:p>
+            <w:r/>
+            <w:r>
+              <w:rPr>
+                <w:b/>
+                <w:color w:val="FFFFFF"/>
+                <w:sz w:val="17"/>
+              </w:rPr>
+              <w:t>Item</w:t>
+            </w:r>
+          </w:p>
+        </w:tc>
+        <w:tc>
+          <w:tcPr>
+            <w:tcW w:type="dxa" w:w="2891"/>
+            <w:shd w:val="clear" w:color="auto" w:fill="44546A"/>
+          </w:tcPr>
+          <w:p>
+            <w:r/>
+            <w:r>
+              <w:rPr>
+                <w:b/>
+                <w:color w:val="FFFFFF"/>
+                <w:sz w:val="17"/>
+              </w:rPr>
+              <w:t>Wind at 4 bolts (R1 base)</w:t>
+            </w:r>
+          </w:p>
+        </w:tc>
+        <w:tc>
+          <w:tcPr>
+            <w:tcW w:type="dxa" w:w="2891"/>
+            <w:shd w:val="clear" w:color="auto" w:fill="44546A"/>
+          </w:tcPr>
+          <w:p>
+            <w:r/>
+            <w:r>
+              <w:rPr>
+                <w:b/>
+                <w:color w:val="FFFFFF"/>
+                <w:sz w:val="17"/>
+              </w:rPr>
+              <w:t>Wind as UDL (alt)</w:t>
+            </w:r>
+          </w:p>
+        </w:tc>
+      </w:tr>
+      <w:tr>
+        <w:tc>
+          <w:tcPr>
+            <w:tcW w:type="dxa" w:w="3969"/>
+          </w:tcPr>
+          <w:p>
+            <w:r/>
+            <w:r>
+              <w:rPr>
+                <w:sz w:val="17"/>
+              </w:rPr>
+              <w:t>Rafter max |M| (N.m)</w:t>
+            </w:r>
+          </w:p>
+        </w:tc>
+        <w:tc>
+          <w:tcPr>
+            <w:tcW w:type="dxa" w:w="2891"/>
+          </w:tcPr>
+          <w:p>
+            <w:r/>
+            <w:r>
+              <w:rPr>
+                <w:sz w:val="17"/>
+              </w:rPr>
+              <w:t>58.7</w:t>
+            </w:r>
+          </w:p>
+        </w:tc>
+        <w:tc>
+          <w:tcPr>
+            <w:tcW w:type="dxa" w:w="2891"/>
+          </w:tcPr>
+          <w:p>
+            <w:r/>
+            <w:r>
+              <w:rPr>
+                <w:sz w:val="17"/>
+              </w:rPr>
+              <w:t>213.9</w:t>
+            </w:r>
+          </w:p>
+        </w:tc>
+      </w:tr>
+      <w:tr>
+        <w:tc>
+          <w:tcPr>
+            <w:tcW w:type="dxa" w:w="3969"/>
+          </w:tcPr>
+          <w:p>
+            <w:r/>
+            <w:r>
+              <w:rPr>
+                <w:sz w:val="17"/>
+              </w:rPr>
+              <w:t>Rafter N+M utilisation (tension)</w:t>
+            </w:r>
+          </w:p>
+        </w:tc>
+        <w:tc>
+          <w:tcPr>
+            <w:tcW w:type="dxa" w:w="2891"/>
+          </w:tcPr>
+          <w:p>
+            <w:r/>
+            <w:r>
+              <w:rPr>
+                <w:sz w:val="17"/>
+              </w:rPr>
+              <w:t>0.111</w:t>
+            </w:r>
+          </w:p>
+        </w:tc>
+        <w:tc>
+          <w:tcPr>
+            <w:tcW w:type="dxa" w:w="2891"/>
+          </w:tcPr>
+          <w:p>
+            <w:r/>
+            <w:r>
+              <w:rPr>
+                <w:sz w:val="17"/>
+              </w:rPr>
+              <w:t>0.402</w:t>
+            </w:r>
+          </w:p>
+        </w:tc>
+      </w:tr>
+      <w:tr>
+        <w:tc>
+          <w:tcPr>
+            <w:tcW w:type="dxa" w:w="3969"/>
+          </w:tcPr>
+          <w:p>
+            <w:r/>
+            <w:r>
+              <w:rPr>
+                <w:sz w:val="17"/>
+              </w:rPr>
+              <w:t>Rafter N+M utilisation (compression)</w:t>
+            </w:r>
+          </w:p>
+        </w:tc>
+        <w:tc>
+          <w:tcPr>
+            <w:tcW w:type="dxa" w:w="2891"/>
+          </w:tcPr>
+          <w:p>
+            <w:r/>
+            <w:r>
+              <w:rPr>
+                <w:sz w:val="17"/>
+              </w:rPr>
+              <w:t>0.116</w:t>
+            </w:r>
+          </w:p>
+        </w:tc>
+        <w:tc>
+          <w:tcPr>
+            <w:tcW w:type="dxa" w:w="2891"/>
+          </w:tcPr>
+          <w:p>
+            <w:r/>
+            <w:r>
+              <w:rPr>
+                <w:sz w:val="17"/>
+              </w:rPr>
+              <w:t>0.406</w:t>
+            </w:r>
+          </w:p>
+        </w:tc>
+      </w:tr>
+      <w:tr>
+        <w:tc>
+          <w:tcPr>
+            <w:tcW w:type="dxa" w:w="3969"/>
+          </w:tcPr>
+          <w:p>
+            <w:r/>
+            <w:r>
+              <w:rPr>
+                <w:sz w:val="17"/>
+              </w:rPr>
+              <w:t>Rafter deflection (mm; limit 6.48)</w:t>
+            </w:r>
+          </w:p>
+        </w:tc>
+        <w:tc>
+          <w:tcPr>
+            <w:tcW w:type="dxa" w:w="2891"/>
+          </w:tcPr>
+          <w:p>
+            <w:r/>
+            <w:r>
+              <w:rPr>
+                <w:sz w:val="17"/>
+              </w:rPr>
+              <w:t>0.407</w:t>
+            </w:r>
+          </w:p>
+        </w:tc>
+        <w:tc>
+          <w:tcPr>
+            <w:tcW w:type="dxa" w:w="2891"/>
+          </w:tcPr>
+          <w:p>
+            <w:r/>
+            <w:r>
+              <w:rPr>
+                <w:sz w:val="17"/>
+              </w:rPr>
+              <w:t>1.292</w:t>
+            </w:r>
+          </w:p>
+        </w:tc>
+      </w:tr>
+      <w:tr>
+        <w:tc>
+          <w:tcPr>
+            <w:tcW w:type="dxa" w:w="3969"/>
+          </w:tcPr>
+          <w:p>
+            <w:r/>
+            <w:r>
+              <w:rPr>
+                <w:sz w:val="17"/>
+              </w:rPr>
+              <w:t>Reactions / ballast / J-bolts</w:t>
+            </w:r>
+          </w:p>
+        </w:tc>
+        <w:tc>
+          <w:tcPr>
+            <w:tcW w:type="dxa" w:w="2891"/>
+          </w:tcPr>
+          <w:p>
+            <w:r/>
+            <w:r>
+              <w:rPr>
+                <w:sz w:val="17"/>
+              </w:rPr>
+              <w:t>as reported</w:t>
+            </w:r>
+          </w:p>
+        </w:tc>
+        <w:tc>
+          <w:tcPr>
+            <w:tcW w:type="dxa" w:w="2891"/>
+          </w:tcPr>
+          <w:p>
+            <w:r/>
+            <w:r>
+              <w:rPr>
+                <w:sz w:val="17"/>
+              </w:rPr>
+              <w:t>identical (resultant unchanged): L_req 633.4 / 633.4 mm</w:t>
             </w:r>
           </w:p>
         </w:tc>
@@ -9822,6 +11287,150 @@
                 <w:sz w:val="15"/>
               </w:rPr>
               <w:t>19</w:t>
+            </w:r>
+          </w:p>
+        </w:tc>
+        <w:tc>
+          <w:tcPr>
+            <w:tcW w:type="dxa" w:w="2835"/>
+          </w:tcPr>
+          <w:p>
+            <w:r/>
+            <w:r>
+              <w:rPr>
+                <w:sz w:val="15"/>
+              </w:rPr>
+              <w:t>Module dead load = UDL w = Wm/(2 W) on each rafter over the contact length W</w:t>
+            </w:r>
+          </w:p>
+        </w:tc>
+        <w:tc>
+          <w:tcPr>
+            <w:tcW w:type="dxa" w:w="2154"/>
+          </w:tcPr>
+          <w:p>
+            <w:r/>
+            <w:r>
+              <w:rPr>
+                <w:sz w:val="15"/>
+              </w:rPr>
+              <w:t>Client comment R1 (no purlins); statics: 2 rafters, symmetric overhangs</w:t>
+            </w:r>
+          </w:p>
+        </w:tc>
+        <w:tc>
+          <w:tcPr>
+            <w:tcW w:type="dxa" w:w="1871"/>
+          </w:tcPr>
+          <w:p>
+            <w:r/>
+            <w:r>
+              <w:rPr>
+                <w:sz w:val="15"/>
+              </w:rPr>
+              <w:t>Design requirement - load-conserving derivation (check row l_udl_chk = 0)</w:t>
+            </w:r>
+          </w:p>
+        </w:tc>
+        <w:tc>
+          <w:tcPr>
+            <w:tcW w:type="dxa" w:w="2494"/>
+          </w:tcPr>
+          <w:p>
+            <w:r/>
+            <w:r>
+              <w:rPr>
+                <w:sz w:val="15"/>
+              </w:rPr>
+              <w:t>Contact length = module width (module parallel to rafter) is an inference</w:t>
+            </w:r>
+          </w:p>
+        </w:tc>
+      </w:tr>
+      <w:tr>
+        <w:tc>
+          <w:tcPr>
+            <w:tcW w:type="dxa" w:w="397"/>
+          </w:tcPr>
+          <w:p>
+            <w:r/>
+            <w:r>
+              <w:rPr>
+                <w:sz w:val="15"/>
+              </w:rPr>
+              <w:t>20</w:t>
+            </w:r>
+          </w:p>
+        </w:tc>
+        <w:tc>
+          <w:tcPr>
+            <w:tcW w:type="dxa" w:w="2835"/>
+          </w:tcPr>
+          <w:p>
+            <w:r/>
+            <w:r>
+              <w:rPr>
+                <w:sz w:val="15"/>
+              </w:rPr>
+              <w:t>Module wind: bolt points (wind_mode 0) vs UDL (wind_mode 1)</w:t>
+            </w:r>
+          </w:p>
+        </w:tc>
+        <w:tc>
+          <w:tcPr>
+            <w:tcW w:type="dxa" w:w="2154"/>
+          </w:tcPr>
+          <w:p>
+            <w:r/>
+            <w:r>
+              <w:rPr>
+                <w:sz w:val="15"/>
+              </w:rPr>
+              <w:t>Load path via 4 M8 bolts; bounding alternative provided</w:t>
+            </w:r>
+          </w:p>
+        </w:tc>
+        <w:tc>
+          <w:tcPr>
+            <w:tcW w:type="dxa" w:w="1871"/>
+          </w:tcPr>
+          <w:p>
+            <w:r/>
+            <w:r>
+              <w:rPr>
+                <w:sz w:val="15"/>
+              </w:rPr>
+              <w:t>Design choice, both results reported</w:t>
+            </w:r>
+          </w:p>
+        </w:tc>
+        <w:tc>
+          <w:tcPr>
+            <w:tcW w:type="dxa" w:w="2494"/>
+          </w:tcPr>
+          <w:p>
+            <w:r/>
+            <w:r>
+              <w:rPr>
+                <w:sz w:val="15"/>
+              </w:rPr>
+              <w:t>wind_mode 1 raises rafter UR from 0.12 to 0.41</w:t>
+            </w:r>
+          </w:p>
+        </w:tc>
+      </w:tr>
+      <w:tr>
+        <w:tc>
+          <w:tcPr>
+            <w:tcW w:type="dxa" w:w="397"/>
+          </w:tcPr>
+          <w:p>
+            <w:r/>
+            <w:r>
+              <w:rPr>
+                <w:sz w:val="15"/>
+              </w:rPr>
+              <w:t>21</w:t>
             </w:r>
           </w:p>
         </w:tc>

</xml_diff>

<commit_message>
R1: module wind also applied as UDL on the rafters (design basis wind_mode 1)
- Wind on the module: q = (N_module/2)/W normal to the rafter over the contact zone (0.9380 N/mm uplift, 0.5233 N/mm down); STAAD UNI GX/GY on members 8-11
- Bolt-point wind kept as alternate (wind_mode 0, staad/alt/..._windBolts.std)
- Rafter peak M 213.9 N.m (C2 uplift governs), UR 0.41, deflection 1.29 mm; reactions, J-bolts, bolts, ballast unchanged
- Re-verified: solver 2e-10, Excel 308 cells 6e-15, live linkage 4e-15, STAAD round-trip 5e-8

Co-Authored-By: Claude Sonnet 5.5 <noreply@anthropic.com>
Claude-Session: https://claude.ai/code/session_019HoR2givhRNHq9KssEQoeh
</commit_message>
<xml_diff>
--- a/report/CDSCO_45kW_Ballast_MMS_Design_Report.docx
+++ b/report/CDSCO_45kW_Ballast_MMS_Design_Report.docx
@@ -351,7 +351,7 @@
         <w:t xml:space="preserve">Module wind </w:t>
       </w:r>
       <w:r>
-        <w:t>is a different load path: wind suction/pressure is transferred through the four M8 module bolts, so it remains point loads at the bolts (wind_mode 0, as R0). As a bounding case the wind is also applied as a UDL over the contact length (wind_mode 1, alternate STAAD file); both satisfy every check (Section 11).</w:t>
+        <w:t>is likewise a load on the module surface and is applied the same way (instruction): UDL over the contact length, q = (N_module / 2) / W normal to the rafter = 0.9380 N/mm uplift / 0.5233 N/mm downward (wind_mode 1, design basis). The four M8 bolts still carry the module-to-rafter connection (bolt demand = module wind force / 4, unchanged). The R0-style point loads at the bolts are kept as an alternate check (Section 11).</w:t>
       </w:r>
     </w:p>
     <w:p>
@@ -366,7 +366,7 @@
         <w:t xml:space="preserve">Effect: </w:t>
       </w:r>
       <w:r>
-        <w:t>only the rafter changes. Peak rafter moment 58.7 N.m (R0 28.2), rafter utilisation 0.11 (R0 0.05). Reactions, J-bolt forces, base member, bolts and the ballast result are unchanged (resultant and line of action of the module load are the same).</w:t>
+        <w:t>only the rafter changes. Peak rafter moment 213.9 N.m (R0 28.2), rafter utilisation 0.40 (R0 0.05). Reactions, J-bolt forces, base member, bolts and the ballast result are unchanged (resultant and line of action of the module load are the same).</w:t>
       </w:r>
     </w:p>
     <w:tbl>
@@ -523,7 +523,7 @@
               <w:rPr>
                 <w:sz w:val="17"/>
               </w:rPr>
-              <w:t>Rafter max |M|, strength combos (N.m)</w:t>
+              <w:t>Module wind uplift on a rafter (normal)</w:t>
             </w:r>
           </w:p>
         </w:tc>
@@ -537,7 +537,7 @@
               <w:rPr>
                 <w:sz w:val="17"/>
               </w:rPr>
-              <w:t>28.2</w:t>
+              <w:t>2 x 531.9 N at the module bolts</w:t>
             </w:r>
           </w:p>
         </w:tc>
@@ -551,7 +551,7 @@
               <w:rPr>
                 <w:sz w:val="17"/>
               </w:rPr>
-              <w:t>58.7</w:t>
+              <w:t>0.9380 N/mm over 1134 mm</w:t>
             </w:r>
           </w:p>
         </w:tc>
@@ -565,7 +565,7 @@
               <w:rPr>
                 <w:sz w:val="17"/>
               </w:rPr>
-              <w:t>x 2.08</w:t>
+              <w:t>UDL</w:t>
             </w:r>
           </w:p>
         </w:tc>
@@ -581,7 +581,7 @@
               <w:rPr>
                 <w:sz w:val="17"/>
               </w:rPr>
-              <w:t>Rafter N+M utilisation (tension / compression)</w:t>
+              <w:t>Rafter max |M|, strength combos (N.m)</w:t>
             </w:r>
           </w:p>
         </w:tc>
@@ -595,7 +595,7 @@
               <w:rPr>
                 <w:sz w:val="17"/>
               </w:rPr>
-              <w:t>0.054 / 0.058</w:t>
+              <w:t>28.2</w:t>
             </w:r>
           </w:p>
         </w:tc>
@@ -609,7 +609,7 @@
               <w:rPr>
                 <w:sz w:val="17"/>
               </w:rPr>
-              <w:t>0.111 / 0.116</w:t>
+              <w:t>213.9</w:t>
             </w:r>
           </w:p>
         </w:tc>
@@ -623,7 +623,7 @@
               <w:rPr>
                 <w:sz w:val="17"/>
               </w:rPr>
-              <w:t>PASS</w:t>
+              <w:t>x 7.59</w:t>
             </w:r>
           </w:p>
         </w:tc>
@@ -639,6 +639,64 @@
               <w:rPr>
                 <w:sz w:val="17"/>
               </w:rPr>
+              <w:t>Rafter N+M utilisation (tension / compression)</w:t>
+            </w:r>
+          </w:p>
+        </w:tc>
+        <w:tc>
+          <w:tcPr>
+            <w:tcW w:type="dxa" w:w="2438"/>
+          </w:tcPr>
+          <w:p>
+            <w:r/>
+            <w:r>
+              <w:rPr>
+                <w:sz w:val="17"/>
+              </w:rPr>
+              <w:t>0.054 / 0.058</w:t>
+            </w:r>
+          </w:p>
+        </w:tc>
+        <w:tc>
+          <w:tcPr>
+            <w:tcW w:type="dxa" w:w="2438"/>
+          </w:tcPr>
+          <w:p>
+            <w:r/>
+            <w:r>
+              <w:rPr>
+                <w:sz w:val="17"/>
+              </w:rPr>
+              <w:t>0.402 / 0.406</w:t>
+            </w:r>
+          </w:p>
+        </w:tc>
+        <w:tc>
+          <w:tcPr>
+            <w:tcW w:type="dxa" w:w="1361"/>
+          </w:tcPr>
+          <w:p>
+            <w:r/>
+            <w:r>
+              <w:rPr>
+                <w:sz w:val="17"/>
+              </w:rPr>
+              <w:t>PASS</w:t>
+            </w:r>
+          </w:p>
+        </w:tc>
+      </w:tr>
+      <w:tr>
+        <w:tc>
+          <w:tcPr>
+            <w:tcW w:type="dxa" w:w="3515"/>
+          </w:tcPr>
+          <w:p>
+            <w:r/>
+            <w:r>
+              <w:rPr>
+                <w:sz w:val="17"/>
+              </w:rPr>
               <w:t>Rafter deflection, service (mm; limit 6.48)</w:t>
             </w:r>
           </w:p>
@@ -667,7 +725,7 @@
               <w:rPr>
                 <w:sz w:val="17"/>
               </w:rPr>
-              <w:t>0.407</w:t>
+              <w:t>1.292</w:t>
             </w:r>
           </w:p>
         </w:tc>
@@ -1024,7 +1082,7 @@
               <w:rPr>
                 <w:sz w:val="17"/>
               </w:rPr>
-              <w:t>max UR = 0.21</w:t>
+              <w:t>max UR = 0.41</w:t>
             </w:r>
           </w:p>
         </w:tc>
@@ -1254,7 +1312,7 @@
               <w:rPr>
                 <w:sz w:val="17"/>
               </w:rPr>
-              <w:t>UR 0.06</w:t>
+              <w:t>UR 0.20</w:t>
             </w:r>
           </w:p>
         </w:tc>
@@ -1339,7 +1397,7 @@
         <w:t xml:space="preserve">Ballast governs the design. </w:t>
       </w:r>
       <w:r>
-        <w:t>Structural members and bolts are lightly stressed (UR &lt;= 0.21); the ballast blocks are sized by SLIDING under wind uplift (friction mu = 0.4). The drawing does not give the block length; 650 mm is required for 300 x 250 blocks.</w:t>
+        <w:t>Structural members and bolts are lightly stressed (UR &lt;= 0.41); the ballast blocks are sized by SLIDING under wind uplift (friction mu = 0.4). The drawing does not give the block length; 650 mm is required for 300 x 250 blocks.</w:t>
       </w:r>
     </w:p>
     <w:p>
@@ -2183,7 +2241,7 @@
         <w:spacing w:after="20"/>
       </w:pPr>
       <w:r>
-        <w:t>R1 load path: the module rests directly on the two rafters (no purlins). Module dead load is a UDL over the contact length (= module width 1134 mm) of each rafter, w = Wm/(2 W) = module weight per area x tributary width (L/2 = 1139.5 mm). The 439.5 mm module overhang beyond each rafter is carried by the module. Rafter self-weight is a UDL (stubs spread). Module WIND is transferred through the 4 M8 bolts (wind_mode 0); wind_mode 1 applies it as a UDL as well (bounding case) - both satisfy all checks.</w:t>
+        <w:t>R1 load path: the module rests directly on the two rafters (no purlins). Module dead load is a UDL over the contact length (= module width 1134 mm) of each rafter, w = Wm/(2 W) = module weight per area x tributary width (L/2 = 1139.5 mm). The 439.5 mm module overhang beyond each rafter is carried by the module. Rafter self-weight is a UDL (stubs spread). Module WIND is treated the same way: UDL over the contact length, q = (N_module/2)/W normal to the rafter (wind_mode 1, design basis); the 4 M8 bolts still carry the connection (bolt demand = module wind force/4). wind_mode 0 (point loads at the bolts) is kept as an alternate check.</w:t>
       </w:r>
     </w:p>
     <w:p>
@@ -3897,7 +3955,7 @@
           <w:b w:val="0"/>
           <w:i w:val="0"/>
         </w:rPr>
-        <w:t>The frame is analysed as a plane model (STAAD file staad/CDSCO_45kW_Ballast_Frame.std, 12 nodes, 12 members): single-bolt joints are moment-free (vertical member is a truss element; rafter pinned at C); the base member is continuous over four rigid J-bolt supports (J1 restrained in X and Y, J2-J4 in Y). R1 loads: module dead load and rafter self-weight are UDLs on the rafter (zone Pa-Pb, members 8-11 / 7-12); wind acts through the four module bolts (joint loads at S1, S2). The rafter and vertical member are statically determinate; its internal forces use closed-form shear/moment with the UDL zones and the exact zero-shear section. The base beam is solved with the three-moment equation in the workbook and with a full stiffness solution in STAAD.</w:t>
+        <w:t>The frame is analysed as a plane model (STAAD file staad/CDSCO_45kW_Ballast_Frame.std, 12 nodes, 12 members): single-bolt joints are moment-free (vertical member is a truss element; rafter pinned at C); the base member is continuous over four rigid J-bolt supports (J1 restrained in X and Y, J2-J4 in Y). R1 loads: module dead load and rafter self-weight are UDLs on the rafter (zone Pa-Pb, members 8-11 / 7-12); module wind is a UDL over the same zone (UNI GX/GY on members 8-11). The rafter and vertical member are statically determinate; its internal forces use closed-form shear/moment with the UDL zones and the exact zero-shear section. The base beam is solved with the three-moment equation in the workbook and with a full stiffness solution in STAAD.</w:t>
       </w:r>
     </w:p>
     <w:tbl>
@@ -4256,7 +4314,7 @@
               <w:rPr>
                 <w:sz w:val="17"/>
               </w:rPr>
-              <w:t>23.0 / 22.2 / 58.7</w:t>
+              <w:t>22.8 / 22.0 / 174.7</w:t>
             </w:r>
           </w:p>
         </w:tc>
@@ -4270,7 +4328,7 @@
               <w:rPr>
                 <w:sz w:val="17"/>
               </w:rPr>
-              <w:t>28.3 / 27.3 / 6.1</w:t>
+              <w:t>27.9 / 26.9 / 213.9</w:t>
             </w:r>
           </w:p>
         </w:tc>
@@ -4711,7 +4769,7 @@
               <w:rPr>
                 <w:sz w:val="17"/>
               </w:rPr>
-              <w:t>N 104 N, M 58.7 N.m</w:t>
+              <w:t>N 104 N, M 213.9 N.m</w:t>
             </w:r>
           </w:p>
         </w:tc>
@@ -4739,7 +4797,7 @@
               <w:rPr>
                 <w:sz w:val="17"/>
               </w:rPr>
-              <w:t>0.111</w:t>
+              <w:t>0.402</w:t>
             </w:r>
           </w:p>
         </w:tc>
@@ -4769,7 +4827,7 @@
               <w:rPr>
                 <w:sz w:val="17"/>
               </w:rPr>
-              <w:t>N 157 N, M 58.7 N.m</w:t>
+              <w:t>N 157 N, M 213.9 N.m</w:t>
             </w:r>
           </w:p>
         </w:tc>
@@ -4797,7 +4855,7 @@
               <w:rPr>
                 <w:sz w:val="17"/>
               </w:rPr>
-              <w:t>0.116</w:t>
+              <w:t>0.406</w:t>
             </w:r>
           </w:p>
         </w:tc>
@@ -4827,7 +4885,7 @@
               <w:rPr>
                 <w:sz w:val="17"/>
               </w:rPr>
-              <w:t>719 N</w:t>
+              <w:t>716 N</w:t>
             </w:r>
           </w:p>
         </w:tc>
@@ -8134,7 +8192,7 @@
               <w:rPr>
                 <w:sz w:val="17"/>
               </w:rPr>
-              <w:t>0.029</w:t>
+              <w:t>1.292</w:t>
             </w:r>
           </w:p>
         </w:tc>
@@ -8162,7 +8220,7 @@
               <w:rPr>
                 <w:sz w:val="17"/>
               </w:rPr>
-              <w:t>0.004</w:t>
+              <w:t>0.200</w:t>
             </w:r>
           </w:p>
         </w:tc>
@@ -9235,7 +9293,7 @@
           <w:b/>
           <w:i w:val="0"/>
         </w:rPr>
-        <w:t>Module wind as UDL (wind_mode 1) instead of through the four bolts - bounding case for the rafter:</w:t>
+        <w:t>Module wind as point loads at the four bolts (wind_mode 0, R0-style load path) - alternate check for the rafter:</w:t>
       </w:r>
     </w:p>
     <w:tbl>
@@ -9283,7 +9341,7 @@
                 <w:color w:val="FFFFFF"/>
                 <w:sz w:val="17"/>
               </w:rPr>
-              <w:t>Wind at 4 bolts (R1 base)</w:t>
+              <w:t>Wind as UDL (R1 design basis)</w:t>
             </w:r>
           </w:p>
         </w:tc>
@@ -9300,7 +9358,7 @@
                 <w:color w:val="FFFFFF"/>
                 <w:sz w:val="17"/>
               </w:rPr>
-              <w:t>Wind as UDL (alt)</w:t>
+              <w:t>Wind at the 4 bolts (alternate)</w:t>
             </w:r>
           </w:p>
         </w:tc>
@@ -9330,21 +9388,21 @@
               <w:rPr>
                 <w:sz w:val="17"/>
               </w:rPr>
+              <w:t>213.9</w:t>
+            </w:r>
+          </w:p>
+        </w:tc>
+        <w:tc>
+          <w:tcPr>
+            <w:tcW w:type="dxa" w:w="2891"/>
+          </w:tcPr>
+          <w:p>
+            <w:r/>
+            <w:r>
+              <w:rPr>
+                <w:sz w:val="17"/>
+              </w:rPr>
               <w:t>58.7</w:t>
-            </w:r>
-          </w:p>
-        </w:tc>
-        <w:tc>
-          <w:tcPr>
-            <w:tcW w:type="dxa" w:w="2891"/>
-          </w:tcPr>
-          <w:p>
-            <w:r/>
-            <w:r>
-              <w:rPr>
-                <w:sz w:val="17"/>
-              </w:rPr>
-              <w:t>213.9</w:t>
             </w:r>
           </w:p>
         </w:tc>
@@ -9374,21 +9432,21 @@
               <w:rPr>
                 <w:sz w:val="17"/>
               </w:rPr>
+              <w:t>0.402</w:t>
+            </w:r>
+          </w:p>
+        </w:tc>
+        <w:tc>
+          <w:tcPr>
+            <w:tcW w:type="dxa" w:w="2891"/>
+          </w:tcPr>
+          <w:p>
+            <w:r/>
+            <w:r>
+              <w:rPr>
+                <w:sz w:val="17"/>
+              </w:rPr>
               <w:t>0.111</w:t>
-            </w:r>
-          </w:p>
-        </w:tc>
-        <w:tc>
-          <w:tcPr>
-            <w:tcW w:type="dxa" w:w="2891"/>
-          </w:tcPr>
-          <w:p>
-            <w:r/>
-            <w:r>
-              <w:rPr>
-                <w:sz w:val="17"/>
-              </w:rPr>
-              <w:t>0.402</w:t>
             </w:r>
           </w:p>
         </w:tc>
@@ -9418,21 +9476,21 @@
               <w:rPr>
                 <w:sz w:val="17"/>
               </w:rPr>
+              <w:t>0.406</w:t>
+            </w:r>
+          </w:p>
+        </w:tc>
+        <w:tc>
+          <w:tcPr>
+            <w:tcW w:type="dxa" w:w="2891"/>
+          </w:tcPr>
+          <w:p>
+            <w:r/>
+            <w:r>
+              <w:rPr>
+                <w:sz w:val="17"/>
+              </w:rPr>
               <w:t>0.116</w:t>
-            </w:r>
-          </w:p>
-        </w:tc>
-        <w:tc>
-          <w:tcPr>
-            <w:tcW w:type="dxa" w:w="2891"/>
-          </w:tcPr>
-          <w:p>
-            <w:r/>
-            <w:r>
-              <w:rPr>
-                <w:sz w:val="17"/>
-              </w:rPr>
-              <w:t>0.406</w:t>
             </w:r>
           </w:p>
         </w:tc>
@@ -9462,21 +9520,21 @@
               <w:rPr>
                 <w:sz w:val="17"/>
               </w:rPr>
+              <w:t>1.292</w:t>
+            </w:r>
+          </w:p>
+        </w:tc>
+        <w:tc>
+          <w:tcPr>
+            <w:tcW w:type="dxa" w:w="2891"/>
+          </w:tcPr>
+          <w:p>
+            <w:r/>
+            <w:r>
+              <w:rPr>
+                <w:sz w:val="17"/>
+              </w:rPr>
               <w:t>0.407</w:t>
-            </w:r>
-          </w:p>
-        </w:tc>
-        <w:tc>
-          <w:tcPr>
-            <w:tcW w:type="dxa" w:w="2891"/>
-          </w:tcPr>
-          <w:p>
-            <w:r/>
-            <w:r>
-              <w:rPr>
-                <w:sz w:val="17"/>
-              </w:rPr>
-              <w:t>1.292</w:t>
             </w:r>
           </w:p>
         </w:tc>
@@ -11372,7 +11430,7 @@
               <w:rPr>
                 <w:sz w:val="15"/>
               </w:rPr>
-              <w:t>Module wind: bolt points (wind_mode 0) vs UDL (wind_mode 1)</w:t>
+              <w:t>Module wind applied as UDL on the rafter (wind_mode 1)</w:t>
             </w:r>
           </w:p>
         </w:tc>
@@ -11386,7 +11444,7 @@
               <w:rPr>
                 <w:sz w:val="15"/>
               </w:rPr>
-              <w:t>Load path via 4 M8 bolts; bounding alternative provided</w:t>
+              <w:t>Same tributary treatment as the module dead load: q = (N_module/2)/W normal to the rafter</w:t>
             </w:r>
           </w:p>
         </w:tc>
@@ -11400,7 +11458,7 @@
               <w:rPr>
                 <w:sz w:val="15"/>
               </w:rPr>
-              <w:t>Design choice, both results reported</w:t>
+              <w:t>Design basis R1 (instruction); bolt-point alternative kept as check</w:t>
             </w:r>
           </w:p>
         </w:tc>
@@ -11414,7 +11472,7 @@
               <w:rPr>
                 <w:sz w:val="15"/>
               </w:rPr>
-              <w:t>wind_mode 1 raises rafter UR from 0.12 to 0.41</w:t>
+              <w:t>Bolt-point alternative (wind_mode 0) gives rafter UR 0.12; M8 bolt demand = module wind/4 in both</w:t>
             </w:r>
           </w:p>
         </w:tc>

</xml_diff>